<commit_message>
docx import: parse per-chapter reader Q&A
End a chapter with a "Q&A" / "Questions" Heading 2 and each paragraph under it
becomes a reader question; a bulleted/numbered list under a question supplies
its multiple-choice options (2+ → mcq, otherwise open). The Q&A block is removed
from the readable chapter body. Capped at 12 questions/chapter and 8 options
each; a plain Heading 2 used as a section heading won't trigger it. Import card
rules and the downloadable example doc updated to show the format.

Co-Authored-By: Claude Opus 4.8 <noreply@anthropic.com>
</commit_message>
<xml_diff>
--- a/public/talerooms-example-story.docx
+++ b/public/talerooms-example-story.docx
@@ -26,21 +26,61 @@
         <w:t>two hundred years</w:t>
       </w:r>
       <w:r>
-        <w:t xml:space="preserve">, and Mara intended to keep it standing.</w:t>
+        <w:t>, and Mara intended to keep it standing.</w:t>
+      </w:r>
+    </w:p>
+    <w:p>
+      <w:pPr>
+        <w:pStyle w:val="Heading2"/>
+      </w:pPr>
+      <w:r>
+        <w:t>Q&amp;A</w:t>
       </w:r>
     </w:p>
     <w:p>
       <w:r>
-        <w:t xml:space="preserve">She climbed the </w:t>
+        <w:t>What do you think Mara is most afraid of?</w:t>
       </w:r>
+    </w:p>
+    <w:p>
       <w:r>
-        <w:rPr>
-          <w:i/>
-        </w:rPr>
-        <w:t>spiral stairs</w:t>
+        <w:t>How old is the lighthouse?</w:t>
       </w:r>
+    </w:p>
+    <w:p>
+      <w:pPr>
+        <w:pStyle w:val="ListParagraph"/>
+        <w:numPr>
+          <w:ilvl w:val="0"/>
+          <w:numId w:val="1"/>
+        </w:numPr>
+      </w:pPr>
       <w:r>
-        <w:t xml:space="preserve"> every morning before the dawn could find her.</w:t>
+        <w:t>One hundred years</w:t>
+      </w:r>
+    </w:p>
+    <w:p>
+      <w:pPr>
+        <w:pStyle w:val="ListParagraph"/>
+        <w:numPr>
+          <w:ilvl w:val="0"/>
+          <w:numId w:val="1"/>
+        </w:numPr>
+      </w:pPr>
+      <w:r>
+        <w:t>Two hundred years</w:t>
+      </w:r>
+    </w:p>
+    <w:p>
+      <w:pPr>
+        <w:pStyle w:val="ListParagraph"/>
+        <w:numPr>
+          <w:ilvl w:val="0"/>
+          <w:numId w:val="1"/>
+        </w:numPr>
+      </w:pPr>
+      <w:r>
+        <w:t>Three hundred years</w:t>
       </w:r>
     </w:p>
     <w:p>
@@ -53,24 +93,25 @@
     </w:p>
     <w:p>
       <w:r>
-        <w:t>By midnight the sea had turned to iron and the wind spoke in a language older than the rocks.</w:t>
-      </w:r>
-    </w:p>
-    <w:p>
-      <w:pPr>
-        <w:pStyle w:val="Heading1"/>
-      </w:pPr>
-      <w:r>
-        <w:t>Chapter Three: The Light</w:t>
-      </w:r>
-    </w:p>
-    <w:p>
-      <w:r>
-        <w:t>When the boats came home at first light, every captain swore the beam had reached further than any law of glass allowed.</w:t>
+        <w:t>By midnight the sea had turned to iron.</w:t>
       </w:r>
     </w:p>
   </w:body>
 </w:document>
+</file>
+
+<file path=word/numbering.xml><?xml version="1.0" encoding="utf-8"?>
+<w:numbering xmlns:w="http://schemas.openxmlformats.org/wordprocessingml/2006/main">
+  <w:abstractNum w:abstractNumId="0">
+    <w:lvl w:ilvl="0">
+      <w:numFmt w:val="bullet"/>
+      <w:lvlText w:val="•"/>
+    </w:lvl>
+  </w:abstractNum>
+  <w:num w:numId="1">
+    <w:abstractNumId w:val="0"/>
+  </w:num>
+</w:numbering>
 </file>
 
 <file path=word/styles.xml><?xml version="1.0" encoding="utf-8"?>
@@ -78,5 +119,11 @@
   <w:style w:type="paragraph" w:styleId="Heading1">
     <w:name w:val="heading 1"/>
   </w:style>
+  <w:style w:type="paragraph" w:styleId="Heading2">
+    <w:name w:val="heading 2"/>
+  </w:style>
+  <w:style w:type="paragraph" w:styleId="ListParagraph">
+    <w:name w:val="List Paragraph"/>
+  </w:style>
 </w:styles>
 </file>
</xml_diff>